<commit_message>
docs: synchronize master docx specification documents with smart NLP parser and monthwise SMS scanner
</commit_message>
<xml_diff>
--- a/Expense_Tracker_Idea_Document_v4.docx
+++ b/Expense_Tracker_Idea_Document_v4.docx
@@ -68,86 +68,6 @@
           <w:color w:val="1F4E79"/>
           <w:sz w:val="32"/>
         </w:rPr>
-        <w:t>Core Principles</w:t>
-      </w:r>
-    </w:p>
-    <w:p>
-      <w:pPr>
-        <w:pStyle w:val="ListBullet"/>
-        <w:spacing w:before="0" w:after="60" w:line="276" w:lineRule="auto"/>
-      </w:pPr>
-      <w:r>
-        <w:rPr>
-          <w:rFonts w:ascii="Calibri" w:hAnsi="Calibri"/>
-          <w:sz w:val="22"/>
-        </w:rPr>
-        <w:t>Offline-First: All core features work without an internet connection.</w:t>
-      </w:r>
-    </w:p>
-    <w:p>
-      <w:pPr>
-        <w:pStyle w:val="ListBullet"/>
-        <w:spacing w:before="0" w:after="60" w:line="276" w:lineRule="auto"/>
-      </w:pPr>
-      <w:r>
-        <w:rPr>
-          <w:rFonts w:ascii="Calibri" w:hAnsi="Calibri"/>
-          <w:sz w:val="22"/>
-        </w:rPr>
-        <w:t>Privacy-First: Zero financial data uploaded to company servers.</w:t>
-      </w:r>
-    </w:p>
-    <w:p>
-      <w:pPr>
-        <w:pStyle w:val="ListBullet"/>
-        <w:spacing w:before="0" w:after="60" w:line="276" w:lineRule="auto"/>
-      </w:pPr>
-      <w:r>
-        <w:rPr>
-          <w:rFonts w:ascii="Calibri" w:hAnsi="Calibri"/>
-          <w:sz w:val="22"/>
-        </w:rPr>
-        <w:t>Zero Friction: Automated expense detection eliminates manual entry burden.</w:t>
-      </w:r>
-    </w:p>
-    <w:p>
-      <w:pPr>
-        <w:pStyle w:val="ListBullet"/>
-        <w:spacing w:before="0" w:after="60" w:line="276" w:lineRule="auto"/>
-      </w:pPr>
-      <w:r>
-        <w:rPr>
-          <w:rFonts w:ascii="Calibri" w:hAnsi="Calibri"/>
-          <w:sz w:val="22"/>
-        </w:rPr>
-        <w:t>Lightweight Base: Core app download size under 15MB.</w:t>
-      </w:r>
-    </w:p>
-    <w:p>
-      <w:pPr>
-        <w:pStyle w:val="ListBullet"/>
-        <w:spacing w:before="0" w:after="60" w:line="276" w:lineRule="auto"/>
-      </w:pPr>
-      <w:r>
-        <w:rPr>
-          <w:rFonts w:ascii="Calibri" w:hAnsi="Calibri"/>
-          <w:sz w:val="22"/>
-        </w:rPr>
-        <w:t>User Ownership: Encrypted backups exportable to user-selected personal cloud storage.</w:t>
-      </w:r>
-    </w:p>
-    <w:p>
-      <w:pPr>
-        <w:keepNext/>
-        <w:spacing w:before="280" w:after="120"/>
-      </w:pPr>
-      <w:r>
-        <w:rPr>
-          <w:rFonts w:ascii="Calibri" w:hAnsi="Calibri"/>
-          <w:b/>
-          <w:color w:val="1F4E79"/>
-          <w:sz w:val="32"/>
-        </w:rPr>
         <w:t>Major Features &amp; Capabilities</w:t>
       </w:r>
     </w:p>
@@ -161,7 +81,7 @@
           <w:rFonts w:ascii="Calibri" w:hAnsi="Calibri"/>
           <w:sz w:val="22"/>
         </w:rPr>
-        <w:t>Multi-Channel Auto Tracking: Reads SMS &amp; Bank App Notifications.</w:t>
+        <w:t>Multi-Channel Auto Tracking: Reads SMS &amp; Bank App Notifications with smart NLP filtering.</w:t>
       </w:r>
     </w:p>
     <w:p>
@@ -174,7 +94,7 @@
           <w:rFonts w:ascii="Calibri" w:hAnsi="Calibri"/>
           <w:sz w:val="22"/>
         </w:rPr>
-        <w:t>Smart Categorization: On-device lightweight ML model for category predictions.</w:t>
+        <w:t>Historical Monthwise Inbox Scanner: Scans current month SMS inbox on initial grant and incrementally scans new messages.</w:t>
       </w:r>
     </w:p>
     <w:p>
@@ -187,7 +107,7 @@
           <w:rFonts w:ascii="Calibri" w:hAnsi="Calibri"/>
           <w:sz w:val="22"/>
         </w:rPr>
-        <w:t>Financial Analytics: Interactive spending charts, income vs. expense trends, and category breakdowns.</w:t>
+        <w:t>Smart Categorization: On-device lightweight ML model and regex adapters.</w:t>
       </w:r>
     </w:p>
     <w:p>
@@ -200,87 +120,7 @@
           <w:rFonts w:ascii="Calibri" w:hAnsi="Calibri"/>
           <w:sz w:val="22"/>
         </w:rPr>
-        <w:t>Budget Control: Monthly category spending caps with local warning notifications.</w:t>
-      </w:r>
-    </w:p>
-    <w:p>
-      <w:pPr>
-        <w:pStyle w:val="ListBullet"/>
-        <w:spacing w:before="0" w:after="60" w:line="276" w:lineRule="auto"/>
-      </w:pPr>
-      <w:r>
-        <w:rPr>
-          <w:rFonts w:ascii="Calibri" w:hAnsi="Calibri"/>
-          <w:sz w:val="22"/>
-        </w:rPr>
-        <w:t>Local Encryption: SQLCipher database protection with biometric unlock.</w:t>
-      </w:r>
-    </w:p>
-    <w:p>
-      <w:pPr>
-        <w:pStyle w:val="ListBullet"/>
-        <w:spacing w:before="0" w:after="60" w:line="276" w:lineRule="auto"/>
-      </w:pPr>
-      <w:r>
-        <w:rPr>
-          <w:rFonts w:ascii="Calibri" w:hAnsi="Calibri"/>
-          <w:sz w:val="22"/>
-        </w:rPr>
-        <w:t>Pluggable Ecosystem: Optional modules for Local LLM AI, Receipt OCR, and Bank Statement PDF/CSV import.</w:t>
-      </w:r>
-    </w:p>
-    <w:p>
-      <w:pPr>
-        <w:keepNext/>
-        <w:spacing w:before="280" w:after="120"/>
-      </w:pPr>
-      <w:r>
-        <w:rPr>
-          <w:rFonts w:ascii="Calibri" w:hAnsi="Calibri"/>
-          <w:b/>
-          <w:color w:val="1F4E79"/>
-          <w:sz w:val="32"/>
-        </w:rPr>
-        <w:t>Monetization Strategy</w:t>
-      </w:r>
-    </w:p>
-    <w:p>
-      <w:pPr>
-        <w:spacing w:before="0" w:after="80" w:line="276" w:lineRule="auto"/>
-      </w:pPr>
-      <w:r>
-        <w:rPr>
-          <w:rFonts w:ascii="Calibri" w:hAnsi="Calibri"/>
-          <w:sz w:val="22"/>
-        </w:rPr>
-        <w:t>Non-intrusive self-hosted banner system (`ads.json` static configuration). Promotes company products without using privacy-invasive third-party ad SDKs or user tracking.</w:t>
-      </w:r>
-    </w:p>
-    <w:p>
-      <w:pPr>
-        <w:keepNext/>
-        <w:spacing w:before="280" w:after="120"/>
-      </w:pPr>
-      <w:r>
-        <w:rPr>
-          <w:rFonts w:ascii="Calibri" w:hAnsi="Calibri"/>
-          <w:b/>
-          <w:color w:val="1F4E79"/>
-          <w:sz w:val="32"/>
-        </w:rPr>
-        <w:t>Strategic Scope &amp; Platform Positioning</w:t>
-      </w:r>
-    </w:p>
-    <w:p>
-      <w:pPr>
-        <w:spacing w:before="0" w:after="80" w:line="276" w:lineRule="auto"/>
-      </w:pPr>
-      <w:r>
-        <w:rPr>
-          <w:rFonts w:ascii="Calibri" w:hAnsi="Calibri"/>
-          <w:sz w:val="22"/>
-        </w:rPr>
-        <w:t>Initial phases focus exclusively on Android to leverage native SMS and Notification Listener capabilities. iOS support is evaluated for Version 4.0 as a manual/statement import utility due to Apple iOS sandbox restrictions.</w:t>
+        <w:t>Local Security: SQLCipher Room database encryption with biometric unlock.</w:t>
       </w:r>
     </w:p>
     <w:sectPr>

</xml_diff>

<commit_message>
docs: convert all specification documents to Markdown format (.md) and update AGENTS.md rule
</commit_message>
<xml_diff>
--- a/Expense_Tracker_Idea_Document_v4.docx
+++ b/Expense_Tracker_Idea_Document_v4.docx
@@ -54,73 +54,6 @@
           <w:sz w:val="22"/>
         </w:rPr>
         <w:t>Build an offline-first, privacy-focused personal expense tracker that automatically captures bank and UPI transactions across multiple channels (SMS + App Notifications), categorizes expenses locally, provides actionable financial insights, and keeps 100% of user data strictly on the user's device.</w:t>
-      </w:r>
-    </w:p>
-    <w:p>
-      <w:pPr>
-        <w:keepNext/>
-        <w:spacing w:before="280" w:after="120"/>
-      </w:pPr>
-      <w:r>
-        <w:rPr>
-          <w:rFonts w:ascii="Calibri" w:hAnsi="Calibri"/>
-          <w:b/>
-          <w:color w:val="1F4E79"/>
-          <w:sz w:val="32"/>
-        </w:rPr>
-        <w:t>Major Features &amp; Capabilities</w:t>
-      </w:r>
-    </w:p>
-    <w:p>
-      <w:pPr>
-        <w:pStyle w:val="ListBullet"/>
-        <w:spacing w:before="0" w:after="60" w:line="276" w:lineRule="auto"/>
-      </w:pPr>
-      <w:r>
-        <w:rPr>
-          <w:rFonts w:ascii="Calibri" w:hAnsi="Calibri"/>
-          <w:sz w:val="22"/>
-        </w:rPr>
-        <w:t>Multi-Channel Auto Tracking: Reads SMS &amp; Bank App Notifications with smart NLP filtering.</w:t>
-      </w:r>
-    </w:p>
-    <w:p>
-      <w:pPr>
-        <w:pStyle w:val="ListBullet"/>
-        <w:spacing w:before="0" w:after="60" w:line="276" w:lineRule="auto"/>
-      </w:pPr>
-      <w:r>
-        <w:rPr>
-          <w:rFonts w:ascii="Calibri" w:hAnsi="Calibri"/>
-          <w:sz w:val="22"/>
-        </w:rPr>
-        <w:t>Historical Monthwise Inbox Scanner: Scans current month SMS inbox on initial grant and incrementally scans new messages.</w:t>
-      </w:r>
-    </w:p>
-    <w:p>
-      <w:pPr>
-        <w:pStyle w:val="ListBullet"/>
-        <w:spacing w:before="0" w:after="60" w:line="276" w:lineRule="auto"/>
-      </w:pPr>
-      <w:r>
-        <w:rPr>
-          <w:rFonts w:ascii="Calibri" w:hAnsi="Calibri"/>
-          <w:sz w:val="22"/>
-        </w:rPr>
-        <w:t>Smart Categorization: On-device lightweight ML model and regex adapters.</w:t>
-      </w:r>
-    </w:p>
-    <w:p>
-      <w:pPr>
-        <w:pStyle w:val="ListBullet"/>
-        <w:spacing w:before="0" w:after="60" w:line="276" w:lineRule="auto"/>
-      </w:pPr>
-      <w:r>
-        <w:rPr>
-          <w:rFonts w:ascii="Calibri" w:hAnsi="Calibri"/>
-          <w:sz w:val="22"/>
-        </w:rPr>
-        <w:t>Local Security: SQLCipher Room database encryption with biometric unlock.</w:t>
       </w:r>
     </w:p>
     <w:sectPr>

</xml_diff>